<commit_message>
entrega parcial atualizada e com dados
</commit_message>
<xml_diff>
--- a/MA2026-projeto-pratico/MA2026-entrega-parcial/FatecSP_Proposta_Tecnica.docx
+++ b/MA2026-projeto-pratico/MA2026-entrega-parcial/FatecSP_Proposta_Tecnica.docx
@@ -1,6 +1,6 @@
 
 <file path=word/document.xml><?xml version="1.0" encoding="utf-8"?>
-<w:document xmlns:wpc="http://schemas.microsoft.com/office/word/2010/wordprocessingCanvas" xmlns:cx="http://schemas.microsoft.com/office/drawing/2014/chartex" xmlns:cx1="http://schemas.microsoft.com/office/drawing/2015/9/8/chartex" xmlns:cx2="http://schemas.microsoft.com/office/drawing/2015/10/21/chartex" xmlns:cx3="http://schemas.microsoft.com/office/drawing/2016/5/9/chartex" xmlns:cx4="http://schemas.microsoft.com/office/drawing/2016/5/10/chartex" xmlns:cx5="http://schemas.microsoft.com/office/drawing/2016/5/11/chartex" xmlns:cx6="http://schemas.microsoft.com/office/drawing/2016/5/12/chartex" xmlns:cx7="http://schemas.microsoft.com/office/drawing/2016/5/13/chartex" xmlns:cx8="http://schemas.microsoft.com/office/drawing/2016/5/14/chartex" xmlns:mc="http://schemas.openxmlformats.org/markup-compatibility/2006" xmlns:aink="http://schemas.microsoft.com/office/drawing/2016/ink" xmlns:am3d="http://schemas.microsoft.com/office/drawing/2017/model3d" xmlns:o="urn:schemas-microsoft-com:office:office" xmlns:oel="http://schemas.microsoft.com/office/2019/extlst" xmlns:r="http://schemas.openxmlformats.org/officeDocument/2006/relationships" xmlns:m="http://schemas.openxmlformats.org/officeDocument/2006/math" xmlns:v="urn:schemas-microsoft-com:vml" xmlns:wp14="http://schemas.microsoft.com/office/word/2010/wordprocessingDrawing" xmlns:wp="http://schemas.openxmlformats.org/drawingml/2006/wordprocessingDrawing" xmlns:w10="urn:schemas-microsoft-com:office:word" xmlns:w="http://schemas.openxmlformats.org/wordprocessingml/2006/main" xmlns:w14="http://schemas.microsoft.com/office/word/2010/wordml" xmlns:w15="http://schemas.microsoft.com/office/word/2012/wordml" xmlns:w16cex="http://schemas.microsoft.com/office/word/2018/wordml/cex" xmlns:w16cid="http://schemas.microsoft.com/office/word/2016/wordml/cid" xmlns:w16="http://schemas.microsoft.com/office/word/2018/wordml" xmlns:w16sdtdh="http://schemas.microsoft.com/office/word/2020/wordml/sdtdatahash" xmlns:w16se="http://schemas.microsoft.com/office/word/2015/wordml/symex" xmlns:wpg="http://schemas.microsoft.com/office/word/2010/wordprocessingGroup" xmlns:wpi="http://schemas.microsoft.com/office/word/2010/wordprocessingInk" xmlns:wne="http://schemas.microsoft.com/office/word/2006/wordml" xmlns:wps="http://schemas.microsoft.com/office/word/2010/wordprocessingShape" mc:Ignorable="w14 w15 w16se w16cid w16 w16cex w16sdtdh wp14">
+<w:document xmlns:wpc="http://schemas.microsoft.com/office/word/2010/wordprocessingCanvas" xmlns:cx="http://schemas.microsoft.com/office/drawing/2014/chartex" xmlns:cx1="http://schemas.microsoft.com/office/drawing/2015/9/8/chartex" xmlns:cx2="http://schemas.microsoft.com/office/drawing/2015/10/21/chartex" xmlns:cx3="http://schemas.microsoft.com/office/drawing/2016/5/9/chartex" xmlns:cx4="http://schemas.microsoft.com/office/drawing/2016/5/10/chartex" xmlns:cx5="http://schemas.microsoft.com/office/drawing/2016/5/11/chartex" xmlns:cx6="http://schemas.microsoft.com/office/drawing/2016/5/12/chartex" xmlns:cx7="http://schemas.microsoft.com/office/drawing/2016/5/13/chartex" xmlns:cx8="http://schemas.microsoft.com/office/drawing/2016/5/14/chartex" xmlns:mc="http://schemas.openxmlformats.org/markup-compatibility/2006" xmlns:aink="http://schemas.microsoft.com/office/drawing/2016/ink" xmlns:am3d="http://schemas.microsoft.com/office/drawing/2017/model3d" xmlns:o="urn:schemas-microsoft-com:office:office" xmlns:oel="http://schemas.microsoft.com/office/2019/extlst" xmlns:r="http://schemas.openxmlformats.org/officeDocument/2006/relationships" xmlns:m="http://schemas.openxmlformats.org/officeDocument/2006/math" xmlns:v="urn:schemas-microsoft-com:vml" xmlns:wp14="http://schemas.microsoft.com/office/word/2010/wordprocessingDrawing" xmlns:wp="http://schemas.openxmlformats.org/drawingml/2006/wordprocessingDrawing" xmlns:w10="urn:schemas-microsoft-com:office:word" xmlns:w="http://schemas.openxmlformats.org/wordprocessingml/2006/main" xmlns:w14="http://schemas.microsoft.com/office/word/2010/wordml" xmlns:w15="http://schemas.microsoft.com/office/word/2012/wordml" xmlns:w16cex="http://schemas.microsoft.com/office/word/2018/wordml/cex" xmlns:w16cid="http://schemas.microsoft.com/office/word/2016/wordml/cid" xmlns:w16="http://schemas.microsoft.com/office/word/2018/wordml" xmlns:w16du="http://schemas.microsoft.com/office/word/2023/wordml/word16du" xmlns:w16sdtdh="http://schemas.microsoft.com/office/word/2020/wordml/sdtdatahash" xmlns:w16sdtfl="http://schemas.microsoft.com/office/word/2024/wordml/sdtformatlock" xmlns:w16se="http://schemas.microsoft.com/office/word/2015/wordml/symex" xmlns:wpg="http://schemas.microsoft.com/office/word/2010/wordprocessingGroup" xmlns:wpi="http://schemas.microsoft.com/office/word/2010/wordprocessingInk" xmlns:wne="http://schemas.microsoft.com/office/word/2006/wordml" xmlns:wps="http://schemas.microsoft.com/office/word/2010/wordprocessingShape" mc:Ignorable="w14 w15 w16se w16cid w16 w16cex w16sdtdh w16sdtfl w16du wp14">
   <w:body>
     <w:p>
       <w:pPr>
@@ -157,25 +157,7 @@
           <w:iCs/>
           <w:color w:val="000000"/>
         </w:rPr>
-        <w:t>Baseado no Projeto Modelo “</w:t>
-      </w:r>
-      <w:proofErr w:type="spellStart"/>
-      <w:r>
-        <w:rPr>
-          <w:i/>
-          <w:iCs/>
-          <w:color w:val="000000"/>
-        </w:rPr>
-        <w:t>CaféData</w:t>
-      </w:r>
-      <w:proofErr w:type="spellEnd"/>
-      <w:r>
-        <w:rPr>
-          <w:i/>
-          <w:iCs/>
-          <w:color w:val="000000"/>
-        </w:rPr>
-        <w:t xml:space="preserve"> Brasil”</w:t>
+        <w:t>Baseado no Projeto Modelo “CaféData Brasil”</w:t>
       </w:r>
     </w:p>
     <w:p>
@@ -352,19 +334,8 @@
             <w:vAlign w:val="center"/>
           </w:tcPr>
           <w:p>
-            <w:proofErr w:type="spellStart"/>
-            <w:r>
-              <w:rPr>
-                <w:color w:val="000000"/>
-              </w:rPr>
-              <w:t>Ex</w:t>
-            </w:r>
-            <w:proofErr w:type="spellEnd"/>
-            <w:r>
-              <w:rPr>
-                <w:color w:val="000000"/>
-              </w:rPr>
-              <w:t>: 123456</w:t>
+            <w:r>
+              <w:t>0020482521048</w:t>
             </w:r>
           </w:p>
         </w:tc>
@@ -385,7 +356,7 @@
               <w:rPr>
                 <w:color w:val="000000"/>
               </w:rPr>
-              <w:t>[Aluno 1 - Líder do Projeto]</w:t>
+              <w:t>Vicente O. Fresillo</w:t>
             </w:r>
           </w:p>
         </w:tc>
@@ -426,7 +397,7 @@
           </w:tcPr>
           <w:p>
             <w:r>
-              <w:t>0020482313026</w:t>
+              <w:t>22106311</w:t>
             </w:r>
           </w:p>
         </w:tc>
@@ -444,7 +415,7 @@
           </w:tcPr>
           <w:p>
             <w:r>
-              <w:t>RENAN SILVA DE MELO</w:t>
+              <w:t>Victoria Oliveira de Souza</w:t>
             </w:r>
           </w:p>
         </w:tc>
@@ -484,19 +455,11 @@
             <w:vAlign w:val="center"/>
           </w:tcPr>
           <w:p>
-            <w:proofErr w:type="spellStart"/>
             <w:r>
               <w:rPr>
                 <w:color w:val="000000"/>
               </w:rPr>
-              <w:t>Ex</w:t>
-            </w:r>
-            <w:proofErr w:type="spellEnd"/>
-            <w:r>
-              <w:rPr>
-                <w:color w:val="000000"/>
-              </w:rPr>
-              <w:t>: 123458</w:t>
+              <w:t>22106759</w:t>
             </w:r>
           </w:p>
         </w:tc>
@@ -517,7 +480,7 @@
               <w:rPr>
                 <w:color w:val="000000"/>
               </w:rPr>
-              <w:t>[Aluno 3]</w:t>
+              <w:t>Amanda Pires Cardoso</w:t>
             </w:r>
           </w:p>
         </w:tc>
@@ -558,10 +521,7 @@
           </w:tcPr>
           <w:p>
             <w:r>
-              <w:rPr>
-                <w:color w:val="000000"/>
-              </w:rPr>
-              <w:t>0020482313097</w:t>
+              <w:t>0020482421030</w:t>
             </w:r>
           </w:p>
         </w:tc>
@@ -582,7 +542,7 @@
               <w:rPr>
                 <w:color w:val="000000"/>
               </w:rPr>
-              <w:t>PEDRO HENRIQUE OLIVEIRA DE FARIAS</w:t>
+              <w:t>MARINA G F B BUENO</w:t>
             </w:r>
           </w:p>
         </w:tc>
@@ -622,19 +582,11 @@
             <w:vAlign w:val="center"/>
           </w:tcPr>
           <w:p>
-            <w:proofErr w:type="spellStart"/>
             <w:r>
               <w:rPr>
                 <w:color w:val="000000"/>
               </w:rPr>
-              <w:t>Ex</w:t>
-            </w:r>
-            <w:proofErr w:type="spellEnd"/>
-            <w:r>
-              <w:rPr>
-                <w:color w:val="000000"/>
-              </w:rPr>
-              <w:t>: 123888</w:t>
+              <w:t>0020482313040</w:t>
             </w:r>
           </w:p>
         </w:tc>
@@ -655,7 +607,7 @@
               <w:rPr>
                 <w:color w:val="000000"/>
               </w:rPr>
-              <w:t>[Aluno 5]</w:t>
+              <w:t>César Rocha Nascimento</w:t>
             </w:r>
           </w:p>
         </w:tc>
@@ -695,19 +647,8 @@
             <w:vAlign w:val="center"/>
           </w:tcPr>
           <w:p>
-            <w:proofErr w:type="spellStart"/>
-            <w:r>
-              <w:rPr>
-                <w:color w:val="000000"/>
-              </w:rPr>
-              <w:t>Ex</w:t>
-            </w:r>
-            <w:proofErr w:type="spellEnd"/>
-            <w:r>
-              <w:rPr>
-                <w:color w:val="000000"/>
-              </w:rPr>
-              <w:t>: 123466</w:t>
+            <w:r>
+              <w:t>0020482313026</w:t>
             </w:r>
           </w:p>
         </w:tc>
@@ -725,10 +666,7 @@
           </w:tcPr>
           <w:p>
             <w:r>
-              <w:rPr>
-                <w:color w:val="000000"/>
-              </w:rPr>
-              <w:t>[Aluno 6]</w:t>
+              <w:t>RENAN SILVA DE MELO</w:t>
             </w:r>
           </w:p>
         </w:tc>
@@ -768,19 +706,11 @@
             <w:vAlign w:val="center"/>
           </w:tcPr>
           <w:p>
-            <w:proofErr w:type="spellStart"/>
             <w:r>
               <w:rPr>
                 <w:color w:val="000000"/>
               </w:rPr>
-              <w:t>Ex</w:t>
-            </w:r>
-            <w:proofErr w:type="spellEnd"/>
-            <w:r>
-              <w:rPr>
-                <w:color w:val="000000"/>
-              </w:rPr>
-              <w:t>: 123477</w:t>
+              <w:t>0020482313097</w:t>
             </w:r>
           </w:p>
         </w:tc>
@@ -801,7 +731,7 @@
               <w:rPr>
                 <w:color w:val="000000"/>
               </w:rPr>
-              <w:t>[Aluno 7]</w:t>
+              <w:t>PEDRO HENRIQUE OLIVEIRA DE FARIAS</w:t>
             </w:r>
           </w:p>
         </w:tc>
@@ -828,11 +758,6 @@
         </w:tc>
       </w:tr>
     </w:tbl>
-    <w:p>
-      <w:r>
-        <w:t>0020482313040 CÉSAR ROCHA NASCIMENTO a definir</w:t>
-      </w:r>
-    </w:p>
     <w:p/>
     <w:p>
       <w:r>
@@ -1046,23 +971,7 @@
                 <w:sz w:val="21"/>
                 <w:szCs w:val="21"/>
               </w:rPr>
-              <w:t>Esta proposta técnica é o documento formal de planejamento do Projeto Evolutivo de Microinformática Aplicada (ILP590). Com base no projeto modelo “</w:t>
-            </w:r>
-            <w:proofErr w:type="spellStart"/>
-            <w:r>
-              <w:rPr>
-                <w:sz w:val="21"/>
-                <w:szCs w:val="21"/>
-              </w:rPr>
-              <w:t>CaféData</w:t>
-            </w:r>
-            <w:proofErr w:type="spellEnd"/>
-            <w:r>
-              <w:rPr>
-                <w:sz w:val="21"/>
-                <w:szCs w:val="21"/>
-              </w:rPr>
-              <w:t xml:space="preserve"> Brasil” apresentado em sala de aula, cada equipe deverá preencher as seções a seguir aplicando os conceitos ao tema sorteado. O planejamento técnico aprovado guiará todas as entregas do semestre (Parcial 1, Marco de Validação e Entrega Final no Power BI).</w:t>
+              <w:t>Esta proposta técnica é o documento formal de planejamento do Projeto Evolutivo de Microinformática Aplicada (ILP590). Com base no projeto modelo “CaféData Brasil” apresentado em sala de aula, cada equipe deverá preencher as seções a seguir aplicando os conceitos ao tema sorteado. O planejamento técnico aprovado guiará todas as entregas do semestre (Parcial 1, Marco de Validação e Entrega Final no Power BI).</w:t>
             </w:r>
           </w:p>
         </w:tc>
@@ -1228,14 +1137,21 @@
     </w:p>
     <w:p>
       <w:pPr>
-        <w:spacing w:after="160"/>
-      </w:pPr>
-      <w:r>
-        <w:rPr>
-          <w:sz w:val="22"/>
-          <w:szCs w:val="22"/>
-        </w:rPr>
-        <w:t>A ausência de uma visão consolidada sobre os dados de turismo, ocupação, sazonalidade, eventos e avaliações dificulta a identificação dos fatores que influenciam a movimentação turística dos destinos. Dessa forma, torna-se necessário integrar e analisar essas informações para compreender variações na ocupação, no número de visitantes e na demanda turística ao longo dos diferentes períodos e localidades.</w:t>
+        <w:pStyle w:val="Ttulo2"/>
+        <w:spacing w:before="240" w:after="140"/>
+        <w:rPr>
+          <w:color w:val="auto"/>
+          <w:sz w:val="22"/>
+          <w:szCs w:val="22"/>
+        </w:rPr>
+      </w:pPr>
+      <w:r>
+        <w:rPr>
+          <w:color w:val="auto"/>
+          <w:sz w:val="22"/>
+          <w:szCs w:val="22"/>
+        </w:rPr>
+        <w:t>A ausência de uma visão consolidada sobre os dados de turismo, ocupação, sazonalidade, eventos e avaliações dificulta a identificação dos fatores que influenciam a movimentação turística dos destinos. Dessa forma, torna-se necessário integrar e analisar essas informações para compreender variações na ocupação, no número de visitantes e na demanda turística ao longo dos diferentes períodos e localidades. Este projeto tem por objetivo preencher essa lacuna, investigando a relação entre sazonalidade, eventos e avaliações de visitantes, e a ocupação dos destinos turísticos estudados.</w:t>
       </w:r>
     </w:p>
     <w:p>
@@ -1338,25 +1254,7 @@
           <w:sz w:val="22"/>
           <w:szCs w:val="22"/>
         </w:rPr>
-        <w:t xml:space="preserve">Através da utilização integrada de Excel, Power Query, Power </w:t>
-      </w:r>
-      <w:proofErr w:type="spellStart"/>
-      <w:r>
-        <w:rPr>
-          <w:color w:val="000000"/>
-          <w:sz w:val="22"/>
-          <w:szCs w:val="22"/>
-        </w:rPr>
-        <w:t>Pivot</w:t>
-      </w:r>
-      <w:proofErr w:type="spellEnd"/>
-      <w:r>
-        <w:rPr>
-          <w:color w:val="000000"/>
-          <w:sz w:val="22"/>
-          <w:szCs w:val="22"/>
-        </w:rPr>
-        <w:t>, DAX, VBA, banco de dados SQL, APIs externas e Power BI, os dados serão tratados, padronizados e relacionados para permitir a geração de indicadores e visualizações que auxiliem na compreensão do comportamento turístico.</w:t>
+        <w:t>Através da utilização integrada de Excel, Power Query, Power Pivot, DAX, VBA, banco de dados SQL, APIs externas e Power BI, os dados serão tratados, padronizados e relacionados para permitir a geração de indicadores e visualizações que auxiliem na compreensão do comportamento turístico.</w:t>
       </w:r>
     </w:p>
     <w:p>
@@ -1498,43 +1396,7 @@
           <w:sz w:val="22"/>
           <w:szCs w:val="22"/>
         </w:rPr>
-        <w:t xml:space="preserve">Modelar o banco de dados dimensional (Star </w:t>
-      </w:r>
-      <w:proofErr w:type="spellStart"/>
-      <w:r>
-        <w:rPr>
-          <w:color w:val="000000"/>
-          <w:sz w:val="22"/>
-          <w:szCs w:val="22"/>
-        </w:rPr>
-        <w:t>Schema</w:t>
-      </w:r>
-      <w:proofErr w:type="spellEnd"/>
-      <w:r>
-        <w:rPr>
-          <w:color w:val="000000"/>
-          <w:sz w:val="22"/>
-          <w:szCs w:val="22"/>
-        </w:rPr>
-        <w:t xml:space="preserve">) no Power </w:t>
-      </w:r>
-      <w:proofErr w:type="spellStart"/>
-      <w:r>
-        <w:rPr>
-          <w:color w:val="000000"/>
-          <w:sz w:val="22"/>
-          <w:szCs w:val="22"/>
-        </w:rPr>
-        <w:t>Pivot</w:t>
-      </w:r>
-      <w:proofErr w:type="spellEnd"/>
-      <w:r>
-        <w:rPr>
-          <w:color w:val="000000"/>
-          <w:sz w:val="22"/>
-          <w:szCs w:val="22"/>
-        </w:rPr>
-        <w:t xml:space="preserve"> e criar KPIs analíticos via DAX.</w:t>
+        <w:t>Modelar o banco de dados dimensional (Star Schema) no Power Pivot e criar KPIs analíticos via DAX.</w:t>
       </w:r>
     </w:p>
     <w:p>
@@ -1743,29 +1605,7 @@
                 <w:sz w:val="21"/>
                 <w:szCs w:val="21"/>
               </w:rPr>
-              <w:t xml:space="preserve">Dado Bruto → Excel Avançado → Power Query → Power </w:t>
-            </w:r>
-            <w:proofErr w:type="spellStart"/>
-            <w:r>
-              <w:rPr>
-                <w:rFonts w:ascii="Cardo" w:eastAsia="Cardo" w:hAnsi="Cardo" w:cs="Cardo"/>
-                <w:b/>
-                <w:bCs/>
-                <w:sz w:val="21"/>
-                <w:szCs w:val="21"/>
-              </w:rPr>
-              <w:t>Pivot</w:t>
-            </w:r>
-            <w:proofErr w:type="spellEnd"/>
-            <w:r>
-              <w:rPr>
-                <w:rFonts w:ascii="Cardo" w:eastAsia="Cardo" w:hAnsi="Cardo" w:cs="Cardo"/>
-                <w:b/>
-                <w:bCs/>
-                <w:sz w:val="21"/>
-                <w:szCs w:val="21"/>
-              </w:rPr>
-              <w:t>/DAX → VBA → SQL → API/Web → Power BI</w:t>
+              <w:t>Dado Bruto → Excel Avançado → Power Query → Power Pivot/DAX → VBA → SQL → API/Web → Power BI</w:t>
             </w:r>
           </w:p>
         </w:tc>
@@ -1859,47 +1699,29 @@
                 <w:bCs/>
                 <w:color w:val="FFFFFF"/>
               </w:rPr>
-              <w:t xml:space="preserve">Descrição do </w:t>
-            </w:r>
-            <w:proofErr w:type="spellStart"/>
+              <w:t>Descrição do Dataset / Origem</w:t>
+            </w:r>
+          </w:p>
+        </w:tc>
+        <w:tc>
+          <w:tcPr>
+            <w:tcW w:w="3350" w:type="dxa"/>
+            <w:shd w:val="clear" w:color="auto" w:fill="005A82"/>
+            <w:tcMar>
+              <w:top w:w="100" w:type="dxa"/>
+              <w:left w:w="120" w:type="dxa"/>
+              <w:bottom w:w="100" w:type="dxa"/>
+              <w:right w:w="120" w:type="dxa"/>
+            </w:tcMar>
+            <w:vAlign w:val="center"/>
+          </w:tcPr>
+          <w:p>
             <w:r>
               <w:rPr>
                 <w:b/>
                 <w:bCs/>
                 <w:color w:val="FFFFFF"/>
               </w:rPr>
-              <w:t>Dataset</w:t>
-            </w:r>
-            <w:proofErr w:type="spellEnd"/>
-            <w:r>
-              <w:rPr>
-                <w:b/>
-                <w:bCs/>
-                <w:color w:val="FFFFFF"/>
-              </w:rPr>
-              <w:t xml:space="preserve"> / Origem</w:t>
-            </w:r>
-          </w:p>
-        </w:tc>
-        <w:tc>
-          <w:tcPr>
-            <w:tcW w:w="3350" w:type="dxa"/>
-            <w:shd w:val="clear" w:color="auto" w:fill="005A82"/>
-            <w:tcMar>
-              <w:top w:w="100" w:type="dxa"/>
-              <w:left w:w="120" w:type="dxa"/>
-              <w:bottom w:w="100" w:type="dxa"/>
-              <w:right w:w="120" w:type="dxa"/>
-            </w:tcMar>
-            <w:vAlign w:val="center"/>
-          </w:tcPr>
-          <w:p>
-            <w:r>
-              <w:rPr>
-                <w:b/>
-                <w:bCs/>
-                <w:color w:val="FFFFFF"/>
-              </w:rPr>
               <w:t>Finalidade / Justificativa</w:t>
             </w:r>
           </w:p>
@@ -1919,19 +1741,11 @@
             <w:vAlign w:val="center"/>
           </w:tcPr>
           <w:p>
-            <w:proofErr w:type="spellStart"/>
             <w:r>
               <w:rPr>
                 <w:color w:val="000000"/>
               </w:rPr>
-              <w:t>Dataset</w:t>
-            </w:r>
-            <w:proofErr w:type="spellEnd"/>
-            <w:r>
-              <w:rPr>
-                <w:color w:val="000000"/>
-              </w:rPr>
-              <w:t xml:space="preserve"> Principal</w:t>
+              <w:t>Dataset Principal</w:t>
             </w:r>
           </w:p>
         </w:tc>
@@ -1952,21 +1766,7 @@
               <w:rPr>
                 <w:color w:val="000000"/>
               </w:rPr>
-              <w:t>Planilha bruta simulada (.</w:t>
-            </w:r>
-            <w:proofErr w:type="spellStart"/>
-            <w:r>
-              <w:rPr>
-                <w:color w:val="000000"/>
-              </w:rPr>
-              <w:t>xlsx</w:t>
-            </w:r>
-            <w:proofErr w:type="spellEnd"/>
-            <w:r>
-              <w:rPr>
-                <w:color w:val="000000"/>
-              </w:rPr>
-              <w:t>)</w:t>
+              <w:t>Planilha bruta simulada (.xlsx)</w:t>
             </w:r>
           </w:p>
         </w:tc>
@@ -2031,21 +1831,7 @@
               <w:rPr>
                 <w:color w:val="000000"/>
               </w:rPr>
-              <w:t>API REST Pública [</w:t>
-            </w:r>
-            <w:proofErr w:type="spellStart"/>
-            <w:r>
-              <w:rPr>
-                <w:color w:val="000000"/>
-              </w:rPr>
-              <w:t>Ex</w:t>
-            </w:r>
-            <w:proofErr w:type="spellEnd"/>
-            <w:r>
-              <w:rPr>
-                <w:color w:val="000000"/>
-              </w:rPr>
-              <w:t>: Clima, Cotação, CEP]</w:t>
+              <w:t>API REST Pública [Ex: Clima, Cotação, CEP]</w:t>
             </w:r>
           </w:p>
         </w:tc>
@@ -2110,35 +1896,7 @@
               <w:rPr>
                 <w:color w:val="000000"/>
               </w:rPr>
-              <w:t>SGBD [</w:t>
-            </w:r>
-            <w:proofErr w:type="spellStart"/>
-            <w:r>
-              <w:rPr>
-                <w:color w:val="000000"/>
-              </w:rPr>
-              <w:t>Ex</w:t>
-            </w:r>
-            <w:proofErr w:type="spellEnd"/>
-            <w:r>
-              <w:rPr>
-                <w:color w:val="000000"/>
-              </w:rPr>
-              <w:t xml:space="preserve">: MySQL / </w:t>
-            </w:r>
-            <w:proofErr w:type="spellStart"/>
-            <w:r>
-              <w:rPr>
-                <w:color w:val="000000"/>
-              </w:rPr>
-              <w:t>SQLite</w:t>
-            </w:r>
-            <w:proofErr w:type="spellEnd"/>
-            <w:r>
-              <w:rPr>
-                <w:color w:val="000000"/>
-              </w:rPr>
-              <w:t xml:space="preserve"> / PostgreSQL]</w:t>
+              <w:t>SGBD [Ex: MySQL / SQLite / PostgreSQL]</w:t>
             </w:r>
           </w:p>
         </w:tc>
@@ -2522,7 +2280,6 @@
         </w:rPr>
         <w:t>Tabela Fato (</w:t>
       </w:r>
-      <w:proofErr w:type="spellStart"/>
       <w:r>
         <w:rPr>
           <w:b/>
@@ -2533,7 +2290,6 @@
         </w:rPr>
         <w:t>Fato_Turismo</w:t>
       </w:r>
-      <w:proofErr w:type="spellEnd"/>
       <w:r>
         <w:rPr>
           <w:b/>
@@ -2880,7 +2636,6 @@
           <w:szCs w:val="22"/>
         </w:rPr>
       </w:pPr>
-      <w:proofErr w:type="spellStart"/>
       <w:r>
         <w:rPr>
           <w:b/>
@@ -2890,7 +2645,6 @@
         </w:rPr>
         <w:t>Dim_Calendario</w:t>
       </w:r>
-      <w:proofErr w:type="spellEnd"/>
     </w:p>
     <w:p>
       <w:pPr>
@@ -3108,7 +2862,6 @@
           <w:szCs w:val="22"/>
         </w:rPr>
       </w:pPr>
-      <w:proofErr w:type="spellStart"/>
       <w:r>
         <w:rPr>
           <w:b/>
@@ -3118,7 +2871,6 @@
         </w:rPr>
         <w:t>Dim_Localidade</w:t>
       </w:r>
-      <w:proofErr w:type="spellEnd"/>
     </w:p>
     <w:p>
       <w:pPr>
@@ -3276,7 +3028,6 @@
           <w:szCs w:val="22"/>
         </w:rPr>
       </w:pPr>
-      <w:proofErr w:type="spellStart"/>
       <w:r>
         <w:rPr>
           <w:b/>
@@ -3286,7 +3037,6 @@
         </w:rPr>
         <w:t>Dim_Evento</w:t>
       </w:r>
-      <w:proofErr w:type="spellEnd"/>
     </w:p>
     <w:p>
       <w:pPr>
@@ -3504,7 +3254,6 @@
           <w:szCs w:val="22"/>
         </w:rPr>
       </w:pPr>
-      <w:proofErr w:type="spellStart"/>
       <w:r>
         <w:rPr>
           <w:b/>
@@ -3514,7 +3263,6 @@
         </w:rPr>
         <w:t>Dim_Avaliacao</w:t>
       </w:r>
-      <w:proofErr w:type="spellEnd"/>
     </w:p>
     <w:p>
       <w:pPr>
@@ -3766,11 +3514,7 @@
         <w:t>Medida relativa de representatividade do mix.</w:t>
       </w:r>
     </w:p>
-    <w:p>
-      <w:r>
-        <w:br w:type="page"/>
-      </w:r>
-    </w:p>
+    <w:p/>
     <w:p>
       <w:pPr>
         <w:pStyle w:val="Ttulo1"/>
@@ -3787,7 +3531,6 @@
           <w:sz w:val="28"/>
           <w:szCs w:val="28"/>
         </w:rPr>
-        <w:lastRenderedPageBreak/>
         <w:t>4. Passos do Planejamento e Cronograma de Execução</w:t>
       </w:r>
     </w:p>
@@ -4133,21 +3876,7 @@
               <w:rPr>
                 <w:color w:val="000000"/>
               </w:rPr>
-              <w:t xml:space="preserve">Excel Avançado, PROCX, </w:t>
-            </w:r>
-            <w:proofErr w:type="spellStart"/>
-            <w:r>
-              <w:rPr>
-                <w:color w:val="000000"/>
-              </w:rPr>
-              <w:t>Audit</w:t>
-            </w:r>
-            <w:proofErr w:type="spellEnd"/>
-            <w:r>
-              <w:rPr>
-                <w:color w:val="000000"/>
-              </w:rPr>
-              <w:t xml:space="preserve"> &amp; Power Query</w:t>
+              <w:t>Excel Avançado, PROCX, Audit &amp; Power Query</w:t>
             </w:r>
           </w:p>
         </w:tc>
@@ -4242,17 +3971,8 @@
                 <w:color w:val="000000"/>
                 <w:lang w:val="en-US"/>
               </w:rPr>
-              <w:t xml:space="preserve">Power Pivot (Star Schema) &amp; DAX </w:t>
-            </w:r>
-            <w:proofErr w:type="spellStart"/>
-            <w:r>
-              <w:rPr>
-                <w:color w:val="000000"/>
-                <w:lang w:val="en-US"/>
-              </w:rPr>
-              <w:t>Inicial</w:t>
-            </w:r>
-            <w:proofErr w:type="spellEnd"/>
+              <w:t>Power Pivot (Star Schema) &amp; DAX Inicial</w:t>
+            </w:r>
           </w:p>
         </w:tc>
         <w:tc>
@@ -4429,21 +4149,7 @@
               <w:rPr>
                 <w:color w:val="000000"/>
               </w:rPr>
-              <w:t>Automação VBA com Macros (.</w:t>
-            </w:r>
-            <w:proofErr w:type="spellStart"/>
-            <w:r>
-              <w:rPr>
-                <w:color w:val="000000"/>
-              </w:rPr>
-              <w:t>bas</w:t>
-            </w:r>
-            <w:proofErr w:type="spellEnd"/>
-            <w:r>
-              <w:rPr>
-                <w:color w:val="000000"/>
-              </w:rPr>
-              <w:t>)</w:t>
+              <w:t>Automação VBA com Macros (.bas)</w:t>
             </w:r>
           </w:p>
         </w:tc>
@@ -4553,21 +4259,7 @@
               <w:rPr>
                 <w:color w:val="000000"/>
               </w:rPr>
-              <w:t>Script .</w:t>
-            </w:r>
-            <w:proofErr w:type="spellStart"/>
-            <w:r>
-              <w:rPr>
-                <w:color w:val="000000"/>
-              </w:rPr>
-              <w:t>sql</w:t>
-            </w:r>
-            <w:proofErr w:type="spellEnd"/>
-            <w:r>
-              <w:rPr>
-                <w:color w:val="000000"/>
-              </w:rPr>
-              <w:t xml:space="preserve"> com queries em 02-bancodedados-sql</w:t>
+              <w:t>Script .sql com queries em 02-bancodedados-sql</w:t>
             </w:r>
           </w:p>
         </w:tc>
@@ -4792,6 +4484,7 @@
               <w:rPr>
                 <w:color w:val="000000"/>
               </w:rPr>
+              <w:lastRenderedPageBreak/>
               <w:t>Etapa 6</w:t>
             </w:r>
           </w:p>
@@ -4819,33 +4512,8 @@
                 <w:color w:val="000000"/>
                 <w:lang w:val="en-US"/>
               </w:rPr>
-              <w:t>Dashboard Power BI (.</w:t>
-            </w:r>
-            <w:proofErr w:type="spellStart"/>
-            <w:r>
-              <w:rPr>
-                <w:color w:val="000000"/>
-                <w:lang w:val="en-US"/>
-              </w:rPr>
-              <w:t>pbix</w:t>
-            </w:r>
-            <w:proofErr w:type="spellEnd"/>
-            <w:r>
-              <w:rPr>
-                <w:color w:val="000000"/>
-                <w:lang w:val="en-US"/>
-              </w:rPr>
-              <w:t xml:space="preserve">) &amp; </w:t>
-            </w:r>
-            <w:proofErr w:type="spellStart"/>
-            <w:r>
-              <w:rPr>
-                <w:color w:val="000000"/>
-                <w:lang w:val="en-US"/>
-              </w:rPr>
-              <w:t>Relatório</w:t>
-            </w:r>
-            <w:proofErr w:type="spellEnd"/>
+              <w:t>Dashboard Power BI (.pbix) &amp; Relatório</w:t>
+            </w:r>
           </w:p>
         </w:tc>
         <w:tc>
@@ -5030,7 +4698,35 @@
           <w:sz w:val="22"/>
           <w:szCs w:val="22"/>
         </w:rPr>
-        <w:t>Data de emissão/entrega da proposta: ____ / ____ / 2026</w:t>
+        <w:t xml:space="preserve">Data de emissão/entrega da proposta: </w:t>
+      </w:r>
+      <w:r>
+        <w:rPr>
+          <w:sz w:val="22"/>
+          <w:szCs w:val="22"/>
+        </w:rPr>
+        <w:t>20</w:t>
+      </w:r>
+      <w:r>
+        <w:rPr>
+          <w:sz w:val="22"/>
+          <w:szCs w:val="22"/>
+        </w:rPr>
+        <w:t xml:space="preserve"> / </w:t>
+      </w:r>
+      <w:r>
+        <w:rPr>
+          <w:sz w:val="22"/>
+          <w:szCs w:val="22"/>
+        </w:rPr>
+        <w:t>09</w:t>
+      </w:r>
+      <w:r>
+        <w:rPr>
+          <w:sz w:val="22"/>
+          <w:szCs w:val="22"/>
+        </w:rPr>
+        <w:t xml:space="preserve"> / 2026</w:t>
       </w:r>
     </w:p>
     <w:sectPr>
@@ -5045,7 +4741,7 @@
 </file>
 
 <file path=word/endnotes.xml><?xml version="1.0" encoding="utf-8"?>
-<w:endnotes xmlns:wpc="http://schemas.microsoft.com/office/word/2010/wordprocessingCanvas" xmlns:cx="http://schemas.microsoft.com/office/drawing/2014/chartex" xmlns:cx1="http://schemas.microsoft.com/office/drawing/2015/9/8/chartex" xmlns:cx2="http://schemas.microsoft.com/office/drawing/2015/10/21/chartex" xmlns:cx3="http://schemas.microsoft.com/office/drawing/2016/5/9/chartex" xmlns:cx4="http://schemas.microsoft.com/office/drawing/2016/5/10/chartex" xmlns:cx5="http://schemas.microsoft.com/office/drawing/2016/5/11/chartex" xmlns:cx6="http://schemas.microsoft.com/office/drawing/2016/5/12/chartex" xmlns:cx7="http://schemas.microsoft.com/office/drawing/2016/5/13/chartex" xmlns:cx8="http://schemas.microsoft.com/office/drawing/2016/5/14/chartex" xmlns:mc="http://schemas.openxmlformats.org/markup-compatibility/2006" xmlns:aink="http://schemas.microsoft.com/office/drawing/2016/ink" xmlns:am3d="http://schemas.microsoft.com/office/drawing/2017/model3d" xmlns:o="urn:schemas-microsoft-com:office:office" xmlns:oel="http://schemas.microsoft.com/office/2019/extlst" xmlns:r="http://schemas.openxmlformats.org/officeDocument/2006/relationships" xmlns:m="http://schemas.openxmlformats.org/officeDocument/2006/math" xmlns:v="urn:schemas-microsoft-com:vml" xmlns:wp14="http://schemas.microsoft.com/office/word/2010/wordprocessingDrawing" xmlns:wp="http://schemas.openxmlformats.org/drawingml/2006/wordprocessingDrawing" xmlns:w10="urn:schemas-microsoft-com:office:word" xmlns:w="http://schemas.openxmlformats.org/wordprocessingml/2006/main" xmlns:w14="http://schemas.microsoft.com/office/word/2010/wordml" xmlns:w15="http://schemas.microsoft.com/office/word/2012/wordml" xmlns:w16cex="http://schemas.microsoft.com/office/word/2018/wordml/cex" xmlns:w16cid="http://schemas.microsoft.com/office/word/2016/wordml/cid" xmlns:w16="http://schemas.microsoft.com/office/word/2018/wordml" xmlns:w16sdtdh="http://schemas.microsoft.com/office/word/2020/wordml/sdtdatahash" xmlns:w16se="http://schemas.microsoft.com/office/word/2015/wordml/symex" xmlns:wpg="http://schemas.microsoft.com/office/word/2010/wordprocessingGroup" xmlns:wpi="http://schemas.microsoft.com/office/word/2010/wordprocessingInk" xmlns:wne="http://schemas.microsoft.com/office/word/2006/wordml" xmlns:wps="http://schemas.microsoft.com/office/word/2010/wordprocessingShape" mc:Ignorable="w14 w15 w16se w16cid w16 w16cex w16sdtdh wp14">
+<w:endnotes xmlns:wpc="http://schemas.microsoft.com/office/word/2010/wordprocessingCanvas" xmlns:cx="http://schemas.microsoft.com/office/drawing/2014/chartex" xmlns:cx1="http://schemas.microsoft.com/office/drawing/2015/9/8/chartex" xmlns:cx2="http://schemas.microsoft.com/office/drawing/2015/10/21/chartex" xmlns:cx3="http://schemas.microsoft.com/office/drawing/2016/5/9/chartex" xmlns:cx4="http://schemas.microsoft.com/office/drawing/2016/5/10/chartex" xmlns:cx5="http://schemas.microsoft.com/office/drawing/2016/5/11/chartex" xmlns:cx6="http://schemas.microsoft.com/office/drawing/2016/5/12/chartex" xmlns:cx7="http://schemas.microsoft.com/office/drawing/2016/5/13/chartex" xmlns:cx8="http://schemas.microsoft.com/office/drawing/2016/5/14/chartex" xmlns:mc="http://schemas.openxmlformats.org/markup-compatibility/2006" xmlns:aink="http://schemas.microsoft.com/office/drawing/2016/ink" xmlns:am3d="http://schemas.microsoft.com/office/drawing/2017/model3d" xmlns:o="urn:schemas-microsoft-com:office:office" xmlns:oel="http://schemas.microsoft.com/office/2019/extlst" xmlns:r="http://schemas.openxmlformats.org/officeDocument/2006/relationships" xmlns:m="http://schemas.openxmlformats.org/officeDocument/2006/math" xmlns:v="urn:schemas-microsoft-com:vml" xmlns:wp14="http://schemas.microsoft.com/office/word/2010/wordprocessingDrawing" xmlns:wp="http://schemas.openxmlformats.org/drawingml/2006/wordprocessingDrawing" xmlns:w10="urn:schemas-microsoft-com:office:word" xmlns:w="http://schemas.openxmlformats.org/wordprocessingml/2006/main" xmlns:w14="http://schemas.microsoft.com/office/word/2010/wordml" xmlns:w15="http://schemas.microsoft.com/office/word/2012/wordml" xmlns:w16cex="http://schemas.microsoft.com/office/word/2018/wordml/cex" xmlns:w16cid="http://schemas.microsoft.com/office/word/2016/wordml/cid" xmlns:w16="http://schemas.microsoft.com/office/word/2018/wordml" xmlns:w16du="http://schemas.microsoft.com/office/word/2023/wordml/word16du" xmlns:w16sdtdh="http://schemas.microsoft.com/office/word/2020/wordml/sdtdatahash" xmlns:w16sdtfl="http://schemas.microsoft.com/office/word/2024/wordml/sdtformatlock" xmlns:w16se="http://schemas.microsoft.com/office/word/2015/wordml/symex" xmlns:wpg="http://schemas.microsoft.com/office/word/2010/wordprocessingGroup" xmlns:wpi="http://schemas.microsoft.com/office/word/2010/wordprocessingInk" xmlns:wne="http://schemas.microsoft.com/office/word/2006/wordml" xmlns:wps="http://schemas.microsoft.com/office/word/2010/wordprocessingShape" mc:Ignorable="w14 w15 w16se w16cid w16 w16cex w16sdtdh w16sdtfl w16du wp14">
   <w:endnote w:type="separator" w:id="-1">
     <w:p>
       <w:r>
@@ -5064,7 +4760,7 @@
 </file>
 
 <file path=word/footer1.xml><?xml version="1.0" encoding="utf-8"?>
-<w:ftr xmlns:wpc="http://schemas.microsoft.com/office/word/2010/wordprocessingCanvas" xmlns:cx="http://schemas.microsoft.com/office/drawing/2014/chartex" xmlns:cx1="http://schemas.microsoft.com/office/drawing/2015/9/8/chartex" xmlns:cx2="http://schemas.microsoft.com/office/drawing/2015/10/21/chartex" xmlns:cx3="http://schemas.microsoft.com/office/drawing/2016/5/9/chartex" xmlns:cx4="http://schemas.microsoft.com/office/drawing/2016/5/10/chartex" xmlns:cx5="http://schemas.microsoft.com/office/drawing/2016/5/11/chartex" xmlns:cx6="http://schemas.microsoft.com/office/drawing/2016/5/12/chartex" xmlns:cx7="http://schemas.microsoft.com/office/drawing/2016/5/13/chartex" xmlns:cx8="http://schemas.microsoft.com/office/drawing/2016/5/14/chartex" xmlns:mc="http://schemas.openxmlformats.org/markup-compatibility/2006" xmlns:aink="http://schemas.microsoft.com/office/drawing/2016/ink" xmlns:am3d="http://schemas.microsoft.com/office/drawing/2017/model3d" xmlns:o="urn:schemas-microsoft-com:office:office" xmlns:oel="http://schemas.microsoft.com/office/2019/extlst" xmlns:r="http://schemas.openxmlformats.org/officeDocument/2006/relationships" xmlns:m="http://schemas.openxmlformats.org/officeDocument/2006/math" xmlns:v="urn:schemas-microsoft-com:vml" xmlns:wp14="http://schemas.microsoft.com/office/word/2010/wordprocessingDrawing" xmlns:wp="http://schemas.openxmlformats.org/drawingml/2006/wordprocessingDrawing" xmlns:w10="urn:schemas-microsoft-com:office:word" xmlns:w="http://schemas.openxmlformats.org/wordprocessingml/2006/main" xmlns:w14="http://schemas.microsoft.com/office/word/2010/wordml" xmlns:w15="http://schemas.microsoft.com/office/word/2012/wordml" xmlns:w16cex="http://schemas.microsoft.com/office/word/2018/wordml/cex" xmlns:w16cid="http://schemas.microsoft.com/office/word/2016/wordml/cid" xmlns:w16="http://schemas.microsoft.com/office/word/2018/wordml" xmlns:w16sdtdh="http://schemas.microsoft.com/office/word/2020/wordml/sdtdatahash" xmlns:w16se="http://schemas.microsoft.com/office/word/2015/wordml/symex" xmlns:wpg="http://schemas.microsoft.com/office/word/2010/wordprocessingGroup" xmlns:wpi="http://schemas.microsoft.com/office/word/2010/wordprocessingInk" xmlns:wne="http://schemas.microsoft.com/office/word/2006/wordml" xmlns:wps="http://schemas.microsoft.com/office/word/2010/wordprocessingShape" mc:Ignorable="w14 w15 w16se w16cid w16 w16cex w16sdtdh wp14">
+<w:ftr xmlns:wpc="http://schemas.microsoft.com/office/word/2010/wordprocessingCanvas" xmlns:cx="http://schemas.microsoft.com/office/drawing/2014/chartex" xmlns:cx1="http://schemas.microsoft.com/office/drawing/2015/9/8/chartex" xmlns:cx2="http://schemas.microsoft.com/office/drawing/2015/10/21/chartex" xmlns:cx3="http://schemas.microsoft.com/office/drawing/2016/5/9/chartex" xmlns:cx4="http://schemas.microsoft.com/office/drawing/2016/5/10/chartex" xmlns:cx5="http://schemas.microsoft.com/office/drawing/2016/5/11/chartex" xmlns:cx6="http://schemas.microsoft.com/office/drawing/2016/5/12/chartex" xmlns:cx7="http://schemas.microsoft.com/office/drawing/2016/5/13/chartex" xmlns:cx8="http://schemas.microsoft.com/office/drawing/2016/5/14/chartex" xmlns:mc="http://schemas.openxmlformats.org/markup-compatibility/2006" xmlns:aink="http://schemas.microsoft.com/office/drawing/2016/ink" xmlns:am3d="http://schemas.microsoft.com/office/drawing/2017/model3d" xmlns:o="urn:schemas-microsoft-com:office:office" xmlns:oel="http://schemas.microsoft.com/office/2019/extlst" xmlns:r="http://schemas.openxmlformats.org/officeDocument/2006/relationships" xmlns:m="http://schemas.openxmlformats.org/officeDocument/2006/math" xmlns:v="urn:schemas-microsoft-com:vml" xmlns:wp14="http://schemas.microsoft.com/office/word/2010/wordprocessingDrawing" xmlns:wp="http://schemas.openxmlformats.org/drawingml/2006/wordprocessingDrawing" xmlns:w10="urn:schemas-microsoft-com:office:word" xmlns:w="http://schemas.openxmlformats.org/wordprocessingml/2006/main" xmlns:w14="http://schemas.microsoft.com/office/word/2010/wordml" xmlns:w15="http://schemas.microsoft.com/office/word/2012/wordml" xmlns:w16cex="http://schemas.microsoft.com/office/word/2018/wordml/cex" xmlns:w16cid="http://schemas.microsoft.com/office/word/2016/wordml/cid" xmlns:w16="http://schemas.microsoft.com/office/word/2018/wordml" xmlns:w16du="http://schemas.microsoft.com/office/word/2023/wordml/word16du" xmlns:w16sdtdh="http://schemas.microsoft.com/office/word/2020/wordml/sdtdatahash" xmlns:w16sdtfl="http://schemas.microsoft.com/office/word/2024/wordml/sdtformatlock" xmlns:w16se="http://schemas.microsoft.com/office/word/2015/wordml/symex" xmlns:wpg="http://schemas.microsoft.com/office/word/2010/wordprocessingGroup" xmlns:wpi="http://schemas.microsoft.com/office/word/2010/wordprocessingInk" xmlns:wne="http://schemas.microsoft.com/office/word/2006/wordml" xmlns:wps="http://schemas.microsoft.com/office/word/2010/wordprocessingShape" mc:Ignorable="w14 w15 w16se w16cid w16 w16cex w16sdtdh w16sdtfl w16du wp14">
   <w:p>
     <w:pPr>
       <w:jc w:val="center"/>
@@ -5123,7 +4819,7 @@
 </file>
 
 <file path=word/footnotes.xml><?xml version="1.0" encoding="utf-8"?>
-<w:footnotes xmlns:wpc="http://schemas.microsoft.com/office/word/2010/wordprocessingCanvas" xmlns:cx="http://schemas.microsoft.com/office/drawing/2014/chartex" xmlns:cx1="http://schemas.microsoft.com/office/drawing/2015/9/8/chartex" xmlns:cx2="http://schemas.microsoft.com/office/drawing/2015/10/21/chartex" xmlns:cx3="http://schemas.microsoft.com/office/drawing/2016/5/9/chartex" xmlns:cx4="http://schemas.microsoft.com/office/drawing/2016/5/10/chartex" xmlns:cx5="http://schemas.microsoft.com/office/drawing/2016/5/11/chartex" xmlns:cx6="http://schemas.microsoft.com/office/drawing/2016/5/12/chartex" xmlns:cx7="http://schemas.microsoft.com/office/drawing/2016/5/13/chartex" xmlns:cx8="http://schemas.microsoft.com/office/drawing/2016/5/14/chartex" xmlns:mc="http://schemas.openxmlformats.org/markup-compatibility/2006" xmlns:aink="http://schemas.microsoft.com/office/drawing/2016/ink" xmlns:am3d="http://schemas.microsoft.com/office/drawing/2017/model3d" xmlns:o="urn:schemas-microsoft-com:office:office" xmlns:oel="http://schemas.microsoft.com/office/2019/extlst" xmlns:r="http://schemas.openxmlformats.org/officeDocument/2006/relationships" xmlns:m="http://schemas.openxmlformats.org/officeDocument/2006/math" xmlns:v="urn:schemas-microsoft-com:vml" xmlns:wp14="http://schemas.microsoft.com/office/word/2010/wordprocessingDrawing" xmlns:wp="http://schemas.openxmlformats.org/drawingml/2006/wordprocessingDrawing" xmlns:w10="urn:schemas-microsoft-com:office:word" xmlns:w="http://schemas.openxmlformats.org/wordprocessingml/2006/main" xmlns:w14="http://schemas.microsoft.com/office/word/2010/wordml" xmlns:w15="http://schemas.microsoft.com/office/word/2012/wordml" xmlns:w16cex="http://schemas.microsoft.com/office/word/2018/wordml/cex" xmlns:w16cid="http://schemas.microsoft.com/office/word/2016/wordml/cid" xmlns:w16="http://schemas.microsoft.com/office/word/2018/wordml" xmlns:w16sdtdh="http://schemas.microsoft.com/office/word/2020/wordml/sdtdatahash" xmlns:w16se="http://schemas.microsoft.com/office/word/2015/wordml/symex" xmlns:wpg="http://schemas.microsoft.com/office/word/2010/wordprocessingGroup" xmlns:wpi="http://schemas.microsoft.com/office/word/2010/wordprocessingInk" xmlns:wne="http://schemas.microsoft.com/office/word/2006/wordml" xmlns:wps="http://schemas.microsoft.com/office/word/2010/wordprocessingShape" mc:Ignorable="w14 w15 w16se w16cid w16 w16cex w16sdtdh wp14">
+<w:footnotes xmlns:wpc="http://schemas.microsoft.com/office/word/2010/wordprocessingCanvas" xmlns:cx="http://schemas.microsoft.com/office/drawing/2014/chartex" xmlns:cx1="http://schemas.microsoft.com/office/drawing/2015/9/8/chartex" xmlns:cx2="http://schemas.microsoft.com/office/drawing/2015/10/21/chartex" xmlns:cx3="http://schemas.microsoft.com/office/drawing/2016/5/9/chartex" xmlns:cx4="http://schemas.microsoft.com/office/drawing/2016/5/10/chartex" xmlns:cx5="http://schemas.microsoft.com/office/drawing/2016/5/11/chartex" xmlns:cx6="http://schemas.microsoft.com/office/drawing/2016/5/12/chartex" xmlns:cx7="http://schemas.microsoft.com/office/drawing/2016/5/13/chartex" xmlns:cx8="http://schemas.microsoft.com/office/drawing/2016/5/14/chartex" xmlns:mc="http://schemas.openxmlformats.org/markup-compatibility/2006" xmlns:aink="http://schemas.microsoft.com/office/drawing/2016/ink" xmlns:am3d="http://schemas.microsoft.com/office/drawing/2017/model3d" xmlns:o="urn:schemas-microsoft-com:office:office" xmlns:oel="http://schemas.microsoft.com/office/2019/extlst" xmlns:r="http://schemas.openxmlformats.org/officeDocument/2006/relationships" xmlns:m="http://schemas.openxmlformats.org/officeDocument/2006/math" xmlns:v="urn:schemas-microsoft-com:vml" xmlns:wp14="http://schemas.microsoft.com/office/word/2010/wordprocessingDrawing" xmlns:wp="http://schemas.openxmlformats.org/drawingml/2006/wordprocessingDrawing" xmlns:w10="urn:schemas-microsoft-com:office:word" xmlns:w="http://schemas.openxmlformats.org/wordprocessingml/2006/main" xmlns:w14="http://schemas.microsoft.com/office/word/2010/wordml" xmlns:w15="http://schemas.microsoft.com/office/word/2012/wordml" xmlns:w16cex="http://schemas.microsoft.com/office/word/2018/wordml/cex" xmlns:w16cid="http://schemas.microsoft.com/office/word/2016/wordml/cid" xmlns:w16="http://schemas.microsoft.com/office/word/2018/wordml" xmlns:w16du="http://schemas.microsoft.com/office/word/2023/wordml/word16du" xmlns:w16sdtdh="http://schemas.microsoft.com/office/word/2020/wordml/sdtdatahash" xmlns:w16sdtfl="http://schemas.microsoft.com/office/word/2024/wordml/sdtformatlock" xmlns:w16se="http://schemas.microsoft.com/office/word/2015/wordml/symex" xmlns:wpg="http://schemas.microsoft.com/office/word/2010/wordprocessingGroup" xmlns:wpi="http://schemas.microsoft.com/office/word/2010/wordprocessingInk" xmlns:wne="http://schemas.microsoft.com/office/word/2006/wordml" xmlns:wps="http://schemas.microsoft.com/office/word/2010/wordprocessingShape" mc:Ignorable="w14 w15 w16se w16cid w16 w16cex w16sdtdh w16sdtfl w16du wp14">
   <w:footnote w:type="separator" w:id="-1">
     <w:p>
       <w:r>
@@ -5142,7 +4838,7 @@
 </file>
 
 <file path=word/header1.xml><?xml version="1.0" encoding="utf-8"?>
-<w:hdr xmlns:wpc="http://schemas.microsoft.com/office/word/2010/wordprocessingCanvas" xmlns:cx="http://schemas.microsoft.com/office/drawing/2014/chartex" xmlns:cx1="http://schemas.microsoft.com/office/drawing/2015/9/8/chartex" xmlns:cx2="http://schemas.microsoft.com/office/drawing/2015/10/21/chartex" xmlns:cx3="http://schemas.microsoft.com/office/drawing/2016/5/9/chartex" xmlns:cx4="http://schemas.microsoft.com/office/drawing/2016/5/10/chartex" xmlns:cx5="http://schemas.microsoft.com/office/drawing/2016/5/11/chartex" xmlns:cx6="http://schemas.microsoft.com/office/drawing/2016/5/12/chartex" xmlns:cx7="http://schemas.microsoft.com/office/drawing/2016/5/13/chartex" xmlns:cx8="http://schemas.microsoft.com/office/drawing/2016/5/14/chartex" xmlns:mc="http://schemas.openxmlformats.org/markup-compatibility/2006" xmlns:aink="http://schemas.microsoft.com/office/drawing/2016/ink" xmlns:am3d="http://schemas.microsoft.com/office/drawing/2017/model3d" xmlns:o="urn:schemas-microsoft-com:office:office" xmlns:oel="http://schemas.microsoft.com/office/2019/extlst" xmlns:r="http://schemas.openxmlformats.org/officeDocument/2006/relationships" xmlns:m="http://schemas.openxmlformats.org/officeDocument/2006/math" xmlns:v="urn:schemas-microsoft-com:vml" xmlns:wp14="http://schemas.microsoft.com/office/word/2010/wordprocessingDrawing" xmlns:wp="http://schemas.openxmlformats.org/drawingml/2006/wordprocessingDrawing" xmlns:w10="urn:schemas-microsoft-com:office:word" xmlns:w="http://schemas.openxmlformats.org/wordprocessingml/2006/main" xmlns:w14="http://schemas.microsoft.com/office/word/2010/wordml" xmlns:w15="http://schemas.microsoft.com/office/word/2012/wordml" xmlns:w16cex="http://schemas.microsoft.com/office/word/2018/wordml/cex" xmlns:w16cid="http://schemas.microsoft.com/office/word/2016/wordml/cid" xmlns:w16="http://schemas.microsoft.com/office/word/2018/wordml" xmlns:w16sdtdh="http://schemas.microsoft.com/office/word/2020/wordml/sdtdatahash" xmlns:w16se="http://schemas.microsoft.com/office/word/2015/wordml/symex" xmlns:wpg="http://schemas.microsoft.com/office/word/2010/wordprocessingGroup" xmlns:wpi="http://schemas.microsoft.com/office/word/2010/wordprocessingInk" xmlns:wne="http://schemas.microsoft.com/office/word/2006/wordml" xmlns:wps="http://schemas.microsoft.com/office/word/2010/wordprocessingShape" mc:Ignorable="w14 w15 w16se w16cid w16 w16cex w16sdtdh wp14">
+<w:hdr xmlns:wpc="http://schemas.microsoft.com/office/word/2010/wordprocessingCanvas" xmlns:cx="http://schemas.microsoft.com/office/drawing/2014/chartex" xmlns:cx1="http://schemas.microsoft.com/office/drawing/2015/9/8/chartex" xmlns:cx2="http://schemas.microsoft.com/office/drawing/2015/10/21/chartex" xmlns:cx3="http://schemas.microsoft.com/office/drawing/2016/5/9/chartex" xmlns:cx4="http://schemas.microsoft.com/office/drawing/2016/5/10/chartex" xmlns:cx5="http://schemas.microsoft.com/office/drawing/2016/5/11/chartex" xmlns:cx6="http://schemas.microsoft.com/office/drawing/2016/5/12/chartex" xmlns:cx7="http://schemas.microsoft.com/office/drawing/2016/5/13/chartex" xmlns:cx8="http://schemas.microsoft.com/office/drawing/2016/5/14/chartex" xmlns:mc="http://schemas.openxmlformats.org/markup-compatibility/2006" xmlns:aink="http://schemas.microsoft.com/office/drawing/2016/ink" xmlns:am3d="http://schemas.microsoft.com/office/drawing/2017/model3d" xmlns:o="urn:schemas-microsoft-com:office:office" xmlns:oel="http://schemas.microsoft.com/office/2019/extlst" xmlns:r="http://schemas.openxmlformats.org/officeDocument/2006/relationships" xmlns:m="http://schemas.openxmlformats.org/officeDocument/2006/math" xmlns:v="urn:schemas-microsoft-com:vml" xmlns:wp14="http://schemas.microsoft.com/office/word/2010/wordprocessingDrawing" xmlns:wp="http://schemas.openxmlformats.org/drawingml/2006/wordprocessingDrawing" xmlns:w10="urn:schemas-microsoft-com:office:word" xmlns:w="http://schemas.openxmlformats.org/wordprocessingml/2006/main" xmlns:w14="http://schemas.microsoft.com/office/word/2010/wordml" xmlns:w15="http://schemas.microsoft.com/office/word/2012/wordml" xmlns:w16cex="http://schemas.microsoft.com/office/word/2018/wordml/cex" xmlns:w16cid="http://schemas.microsoft.com/office/word/2016/wordml/cid" xmlns:w16="http://schemas.microsoft.com/office/word/2018/wordml" xmlns:w16du="http://schemas.microsoft.com/office/word/2023/wordml/word16du" xmlns:w16sdtdh="http://schemas.microsoft.com/office/word/2020/wordml/sdtdatahash" xmlns:w16sdtfl="http://schemas.microsoft.com/office/word/2024/wordml/sdtformatlock" xmlns:w16se="http://schemas.microsoft.com/office/word/2015/wordml/symex" xmlns:wpg="http://schemas.microsoft.com/office/word/2010/wordprocessingGroup" xmlns:wpi="http://schemas.microsoft.com/office/word/2010/wordprocessingInk" xmlns:wne="http://schemas.microsoft.com/office/word/2006/wordml" xmlns:wps="http://schemas.microsoft.com/office/word/2010/wordprocessingShape" mc:Ignorable="w14 w15 w16se w16cid w16 w16cex w16sdtdh w16sdtfl w16du wp14">
   <w:p>
     <w:pPr>
       <w:pBdr>
@@ -5165,7 +4861,7 @@
 </file>
 
 <file path=word/numbering.xml><?xml version="1.0" encoding="utf-8"?>
-<w:numbering xmlns:wpc="http://schemas.microsoft.com/office/word/2010/wordprocessingCanvas" xmlns:cx="http://schemas.microsoft.com/office/drawing/2014/chartex" xmlns:cx1="http://schemas.microsoft.com/office/drawing/2015/9/8/chartex" xmlns:cx2="http://schemas.microsoft.com/office/drawing/2015/10/21/chartex" xmlns:cx3="http://schemas.microsoft.com/office/drawing/2016/5/9/chartex" xmlns:cx4="http://schemas.microsoft.com/office/drawing/2016/5/10/chartex" xmlns:cx5="http://schemas.microsoft.com/office/drawing/2016/5/11/chartex" xmlns:cx6="http://schemas.microsoft.com/office/drawing/2016/5/12/chartex" xmlns:cx7="http://schemas.microsoft.com/office/drawing/2016/5/13/chartex" xmlns:cx8="http://schemas.microsoft.com/office/drawing/2016/5/14/chartex" xmlns:mc="http://schemas.openxmlformats.org/markup-compatibility/2006" xmlns:aink="http://schemas.microsoft.com/office/drawing/2016/ink" xmlns:am3d="http://schemas.microsoft.com/office/drawing/2017/model3d" xmlns:o="urn:schemas-microsoft-com:office:office" xmlns:oel="http://schemas.microsoft.com/office/2019/extlst" xmlns:r="http://schemas.openxmlformats.org/officeDocument/2006/relationships" xmlns:m="http://schemas.openxmlformats.org/officeDocument/2006/math" xmlns:v="urn:schemas-microsoft-com:vml" xmlns:wp14="http://schemas.microsoft.com/office/word/2010/wordprocessingDrawing" xmlns:wp="http://schemas.openxmlformats.org/drawingml/2006/wordprocessingDrawing" xmlns:w10="urn:schemas-microsoft-com:office:word" xmlns:w="http://schemas.openxmlformats.org/wordprocessingml/2006/main" xmlns:w14="http://schemas.microsoft.com/office/word/2010/wordml" xmlns:w15="http://schemas.microsoft.com/office/word/2012/wordml" xmlns:w16cex="http://schemas.microsoft.com/office/word/2018/wordml/cex" xmlns:w16cid="http://schemas.microsoft.com/office/word/2016/wordml/cid" xmlns:w16="http://schemas.microsoft.com/office/word/2018/wordml" xmlns:w16sdtdh="http://schemas.microsoft.com/office/word/2020/wordml/sdtdatahash" xmlns:w16se="http://schemas.microsoft.com/office/word/2015/wordml/symex" xmlns:wpg="http://schemas.microsoft.com/office/word/2010/wordprocessingGroup" xmlns:wpi="http://schemas.microsoft.com/office/word/2010/wordprocessingInk" xmlns:wne="http://schemas.microsoft.com/office/word/2006/wordml" xmlns:wps="http://schemas.microsoft.com/office/word/2010/wordprocessingShape" mc:Ignorable="w14 w15 w16se w16cid w16 w16cex w16sdtdh wp14">
+<w:numbering xmlns:wpc="http://schemas.microsoft.com/office/word/2010/wordprocessingCanvas" xmlns:cx="http://schemas.microsoft.com/office/drawing/2014/chartex" xmlns:cx1="http://schemas.microsoft.com/office/drawing/2015/9/8/chartex" xmlns:cx2="http://schemas.microsoft.com/office/drawing/2015/10/21/chartex" xmlns:cx3="http://schemas.microsoft.com/office/drawing/2016/5/9/chartex" xmlns:cx4="http://schemas.microsoft.com/office/drawing/2016/5/10/chartex" xmlns:cx5="http://schemas.microsoft.com/office/drawing/2016/5/11/chartex" xmlns:cx6="http://schemas.microsoft.com/office/drawing/2016/5/12/chartex" xmlns:cx7="http://schemas.microsoft.com/office/drawing/2016/5/13/chartex" xmlns:cx8="http://schemas.microsoft.com/office/drawing/2016/5/14/chartex" xmlns:mc="http://schemas.openxmlformats.org/markup-compatibility/2006" xmlns:aink="http://schemas.microsoft.com/office/drawing/2016/ink" xmlns:am3d="http://schemas.microsoft.com/office/drawing/2017/model3d" xmlns:o="urn:schemas-microsoft-com:office:office" xmlns:oel="http://schemas.microsoft.com/office/2019/extlst" xmlns:r="http://schemas.openxmlformats.org/officeDocument/2006/relationships" xmlns:m="http://schemas.openxmlformats.org/officeDocument/2006/math" xmlns:v="urn:schemas-microsoft-com:vml" xmlns:wp14="http://schemas.microsoft.com/office/word/2010/wordprocessingDrawing" xmlns:wp="http://schemas.openxmlformats.org/drawingml/2006/wordprocessingDrawing" xmlns:w10="urn:schemas-microsoft-com:office:word" xmlns:w="http://schemas.openxmlformats.org/wordprocessingml/2006/main" xmlns:w14="http://schemas.microsoft.com/office/word/2010/wordml" xmlns:w15="http://schemas.microsoft.com/office/word/2012/wordml" xmlns:w16cex="http://schemas.microsoft.com/office/word/2018/wordml/cex" xmlns:w16cid="http://schemas.microsoft.com/office/word/2016/wordml/cid" xmlns:w16="http://schemas.microsoft.com/office/word/2018/wordml" xmlns:w16du="http://schemas.microsoft.com/office/word/2023/wordml/word16du" xmlns:w16sdtdh="http://schemas.microsoft.com/office/word/2020/wordml/sdtdatahash" xmlns:w16sdtfl="http://schemas.microsoft.com/office/word/2024/wordml/sdtformatlock" xmlns:w16se="http://schemas.microsoft.com/office/word/2015/wordml/symex" xmlns:wpg="http://schemas.microsoft.com/office/word/2010/wordprocessingGroup" xmlns:wpi="http://schemas.microsoft.com/office/word/2010/wordprocessingInk" xmlns:wne="http://schemas.microsoft.com/office/word/2006/wordml" xmlns:wps="http://schemas.microsoft.com/office/word/2010/wordprocessingShape" mc:Ignorable="w14 w15 w16se w16cid w16 w16cex w16sdtdh w16sdtfl w16du wp14">
   <w:abstractNum w:abstractNumId="0" w15:restartNumberingAfterBreak="0">
     <w:nsid w:val="0EDE07CB"/>
     <w:multiLevelType w:val="multilevel"/>
@@ -6340,7 +6036,7 @@
 </file>
 
 <file path=word/styles.xml><?xml version="1.0" encoding="utf-8"?>
-<w:styles xmlns:mc="http://schemas.openxmlformats.org/markup-compatibility/2006" xmlns:r="http://schemas.openxmlformats.org/officeDocument/2006/relationships" xmlns:w="http://schemas.openxmlformats.org/wordprocessingml/2006/main" xmlns:w14="http://schemas.microsoft.com/office/word/2010/wordml" xmlns:w15="http://schemas.microsoft.com/office/word/2012/wordml" xmlns:w16cex="http://schemas.microsoft.com/office/word/2018/wordml/cex" xmlns:w16cid="http://schemas.microsoft.com/office/word/2016/wordml/cid" xmlns:w16="http://schemas.microsoft.com/office/word/2018/wordml" xmlns:w16sdtdh="http://schemas.microsoft.com/office/word/2020/wordml/sdtdatahash" xmlns:w16se="http://schemas.microsoft.com/office/word/2015/wordml/symex" mc:Ignorable="w14 w15 w16se w16cid w16 w16cex w16sdtdh">
+<w:styles xmlns:mc="http://schemas.openxmlformats.org/markup-compatibility/2006" xmlns:r="http://schemas.openxmlformats.org/officeDocument/2006/relationships" xmlns:w="http://schemas.openxmlformats.org/wordprocessingml/2006/main" xmlns:w14="http://schemas.microsoft.com/office/word/2010/wordml" xmlns:w15="http://schemas.microsoft.com/office/word/2012/wordml" xmlns:w16cex="http://schemas.microsoft.com/office/word/2018/wordml/cex" xmlns:w16cid="http://schemas.microsoft.com/office/word/2016/wordml/cid" xmlns:w16="http://schemas.microsoft.com/office/word/2018/wordml" xmlns:w16du="http://schemas.microsoft.com/office/word/2023/wordml/word16du" xmlns:w16sdtdh="http://schemas.microsoft.com/office/word/2020/wordml/sdtdatahash" xmlns:w16sdtfl="http://schemas.microsoft.com/office/word/2024/wordml/sdtformatlock" xmlns:w16se="http://schemas.microsoft.com/office/word/2015/wordml/symex" mc:Ignorable="w14 w15 w16se w16cid w16 w16cex w16sdtdh w16sdtfl w16du">
   <w:docDefaults>
     <w:rPrDefault>
       <w:rPr>

</xml_diff>